<commit_message>
fix(juridico): carta poder con el género del apoderado y el DPI después de su etiqueta
- Hombre: "el apoderado / del apoderado / mi apoderado" (decía "la apoderada").
  Mujer: "quedando facultada" (decía "facultado").
- El DPI del apoderado va después de "Código Único de Identificación", como el
  del representante, y "se identifica" (no "me identifico": no es quien otorga).
- Volver a tocar el crédito elegido lo suelta como "empezar de cero", y los
  datos de un crédito que llegan después de "empezar de cero" no se aplican.

Co-Authored-By: Claude Opus 5.5 <noreply@anthropic.com>
</commit_message>
<xml_diff>
--- a/apps/legal-docs-blueprints/templates/carta_poder/CARTA-CUBE-ANDRES-HOMBRE.docx
+++ b/apps/legal-docs-blueprints/templates/carta_poder/CARTA-CUBE-ANDRES-HOMBRE.docx
@@ -484,71 +484,71 @@
           <w:szCs w:val="18"/>
           <w:rtl w:val="0"/>
         </w:rPr>
-        <w:t xml:space="preserve">{nacionalidad}</w:t>
-      </w:r>
-      <w:r>
-        <w:rPr>
-          <w:rFonts w:ascii="Arial" w:cs="Arial" w:eastAsia="Arial" w:hAnsi="Arial"/>
-          <w:sz w:val="18"/>
-          <w:szCs w:val="18"/>
-          <w:rtl w:val="0"/>
-        </w:rPr>
-        <w:t xml:space="preserve">, de este domicilio</w:t>
-      </w:r>
-      <w:r>
-        <w:rPr>
-          <w:rFonts w:ascii="Arial" w:cs="Arial" w:eastAsia="Arial" w:hAnsi="Arial"/>
-          <w:color w:val="000000"/>
-          <w:sz w:val="18"/>
-          <w:szCs w:val="18"/>
-          <w:rtl w:val="0"/>
-        </w:rPr>
-        <w:t xml:space="preserve">, </w:t>
-      </w:r>
-      <w:r>
-        <w:rPr>
-          <w:rFonts w:ascii="Arial" w:cs="Arial" w:eastAsia="Arial" w:hAnsi="Arial"/>
-          <w:sz w:val="18"/>
-          <w:szCs w:val="18"/>
-          <w:rtl w:val="0"/>
-        </w:rPr>
-        <w:t xml:space="preserve">me identifico con Documento Personal de Identificación, </w:t>
-      </w:r>
-      <w:r>
-        <w:rPr>
-          <w:rFonts w:ascii="Arial" w:cs="Arial" w:eastAsia="Arial" w:hAnsi="Arial"/>
-          <w:sz w:val="18"/>
-          <w:szCs w:val="18"/>
-          <w:rtl w:val="0"/>
-        </w:rPr>
-        <w:t xml:space="preserve">{dpiTexto}</w:t>
-      </w:r>
-      <w:r>
-        <w:rPr>
-          <w:rFonts w:ascii="Arial" w:cs="Arial" w:eastAsia="Arial" w:hAnsi="Arial"/>
-          <w:sz w:val="18"/>
-          <w:szCs w:val="18"/>
-          <w:rtl w:val="0"/>
-        </w:rPr>
-        <w:t xml:space="preserve"> (</w:t>
-      </w:r>
-      <w:r>
-        <w:rPr>
-          <w:rFonts w:ascii="Arial" w:cs="Arial" w:eastAsia="Arial" w:hAnsi="Arial"/>
-          <w:sz w:val="18"/>
-          <w:szCs w:val="18"/>
-          <w:rtl w:val="0"/>
-        </w:rPr>
-        <w:t xml:space="preserve">{dpiNumero}</w:t>
-      </w:r>
-      <w:r>
-        <w:rPr>
-          <w:rFonts w:ascii="Arial" w:cs="Arial" w:eastAsia="Arial" w:hAnsi="Arial"/>
-          <w:sz w:val="18"/>
-          <w:szCs w:val="18"/>
-          <w:rtl w:val="0"/>
-        </w:rPr>
-        <w:t xml:space="preserve">) Código Único de Identificación  extendido por el Registro Nacional de las Personas –RENAP- República de Guatemala Centroamérica</w:t>
+        <w:t xml:space="preserve">{nacionalidad}, de este domicilio, se identifica</w:t>
+      </w:r>
+      <w:r>
+        <w:rPr>
+          <w:rFonts w:ascii="Arial" w:cs="Arial" w:eastAsia="Arial" w:hAnsi="Arial"/>
+          <w:sz w:val="18"/>
+          <w:szCs w:val="18"/>
+          <w:rtl w:val="0"/>
+        </w:rPr>
+        <w:t xml:space="preserve"/>
+      </w:r>
+      <w:r>
+        <w:rPr>
+          <w:rFonts w:ascii="Arial" w:cs="Arial" w:eastAsia="Arial" w:hAnsi="Arial"/>
+          <w:color w:val="000000"/>
+          <w:sz w:val="18"/>
+          <w:szCs w:val="18"/>
+          <w:rtl w:val="0"/>
+        </w:rPr>
+        <w:t xml:space="preserve"/>
+      </w:r>
+      <w:r>
+        <w:rPr>
+          <w:rFonts w:ascii="Arial" w:cs="Arial" w:eastAsia="Arial" w:hAnsi="Arial"/>
+          <w:sz w:val="18"/>
+          <w:szCs w:val="18"/>
+          <w:rtl w:val="0"/>
+        </w:rPr>
+        <w:t xml:space="preserve"> con Documento Personal de Identificación, Código Único de Identificación {dpiTexto} ({dpiNumero}) extendido</w:t>
+      </w:r>
+      <w:r>
+        <w:rPr>
+          <w:rFonts w:ascii="Arial" w:cs="Arial" w:eastAsia="Arial" w:hAnsi="Arial"/>
+          <w:sz w:val="18"/>
+          <w:szCs w:val="18"/>
+          <w:rtl w:val="0"/>
+        </w:rPr>
+        <w:t xml:space="preserve"/>
+      </w:r>
+      <w:r>
+        <w:rPr>
+          <w:rFonts w:ascii="Arial" w:cs="Arial" w:eastAsia="Arial" w:hAnsi="Arial"/>
+          <w:sz w:val="18"/>
+          <w:szCs w:val="18"/>
+          <w:rtl w:val="0"/>
+        </w:rPr>
+        <w:t xml:space="preserve"/>
+      </w:r>
+      <w:r>
+        <w:rPr>
+          <w:rFonts w:ascii="Arial" w:cs="Arial" w:eastAsia="Arial" w:hAnsi="Arial"/>
+          <w:sz w:val="18"/>
+          <w:szCs w:val="18"/>
+          <w:rtl w:val="0"/>
+        </w:rPr>
+        <w:t xml:space="preserve"/>
+      </w:r>
+      <w:r>
+        <w:rPr>
+          <w:rFonts w:ascii="Arial" w:cs="Arial" w:eastAsia="Arial" w:hAnsi="Arial"/>
+          <w:sz w:val="18"/>
+          <w:szCs w:val="18"/>
+          <w:rtl w:val="0"/>
+        </w:rPr>
+        <w:t xml:space="preserve"> por el Registro Nacional de las Personas –RENAP- República de Guatemala Centroamérica</w:t>
       </w:r>
       <w:r>
         <w:rPr>
@@ -1102,7 +1102,7 @@
           <w:szCs w:val="18"/>
           <w:rtl w:val="0"/>
         </w:rPr>
-        <w:t xml:space="preserve">, entendiéndose que dicha circulación se hará bajo la estricta responsabilidad de la apoderada, quedando en consecuencia prohibido utilizar dicho vehículo en contravención con las leyes de Guatemala y de cualquier otro país, pudiendo gestionar los permisos necesarios, así como para contratar toda clase de seguros que sean necesarios para conducir dicho vehículo y el reclamo ante las aseguradoras correspondientes, por si se llegare a causar el evento previsto, así como tramitar y obtener los cheques que paguen dichas aseguradoras para cubrir el evento contratado, por lo que solicito respetuosamente a las autoridades correspondientes nacionales y extranjeras, le presten a mi apoderada la colaboración necesaria para que no tenga ningún obstáculo, como consecuencia, la apoderada es responsable directamente del buen ejercicio del presente poder. </w:t>
+        <w:t xml:space="preserve">, entendiéndose que dicha circulación se hará bajo la estricta responsabilidad del apoderado, quedando en consecuencia prohibido utilizar dicho vehículo en contravención con las leyes de Guatemala y de cualquier otro país, pudiendo gestionar los permisos necesarios, así como para contratar toda clase de seguros que sean necesarios para conducir dicho vehículo y el reclamo ante las aseguradoras correspondientes, por si se llegare a causar el evento previsto, así como tramitar y obtener los cheques que paguen dichas aseguradoras para cubrir el evento contratado, por lo que solicito respetuosamente a las autoridades correspondientes nacionales y extranjeras, le presten a mi apoderado la colaboración necesaria para que no tenga ningún obstáculo, como consecuencia, el apoderado es responsable directamente del buen ejercicio del presente poder. </w:t>
       </w:r>
       <w:r>
         <w:rPr>

</xml_diff>

<commit_message>
fix(juridico): la carta de CUBE con Andrés nombra a CUBE INVESTMENTS en el punto PRIMERO
El encabezado lo presenta como representante de CUBE INVESTMENTS, SOCIEDAD
ANÓNIMA, y el PRIMERO decía "CUBE, SOCIEDAD ANÓNIMA". Ahora las ocho cartas
nombran a la misma entidad en los dos lugares.

Co-Authored-By: Claude Opus 5.5 <noreply@anthropic.com>
</commit_message>
<xml_diff>
--- a/apps/legal-docs-blueprints/templates/carta_poder/CARTA-CUBE-ANDRES-HOMBRE.docx
+++ b/apps/legal-docs-blueprints/templates/carta_poder/CARTA-CUBE-ANDRES-HOMBRE.docx
@@ -625,40 +625,40 @@
           <w:szCs w:val="18"/>
           <w:rtl w:val="0"/>
         </w:rPr>
-        <w:t xml:space="preserve"> en la calidad con que actúo, declaro que mi representada la entidad denominada </w:t>
-      </w:r>
-      <w:r>
-        <w:rPr>
-          <w:rFonts w:ascii="Arial" w:cs="Arial" w:eastAsia="Arial" w:hAnsi="Arial"/>
-          <w:b w:val="1"/>
-          <w:bCs w:val="1"/>
-          <w:sz w:val="18"/>
-          <w:szCs w:val="18"/>
-          <w:rtl w:val="0"/>
-        </w:rPr>
-        <w:t xml:space="preserve">CUBE</w:t>
-      </w:r>
-      <w:r>
-        <w:rPr>
-          <w:rFonts w:ascii="Arial" w:cs="Arial" w:eastAsia="Arial" w:hAnsi="Arial"/>
-          <w:b w:val="1"/>
-          <w:bCs w:val="1"/>
-          <w:color w:val="000000"/>
-          <w:sz w:val="18"/>
-          <w:szCs w:val="18"/>
-          <w:rtl w:val="0"/>
-        </w:rPr>
-        <w:t xml:space="preserve">, SOCIEDAD ANÓNIMA,</w:t>
-      </w:r>
-      <w:r>
-        <w:rPr>
-          <w:rFonts w:ascii="Arial" w:cs="Arial" w:eastAsia="Arial" w:hAnsi="Arial"/>
-          <w:color w:val="000000"/>
-          <w:sz w:val="18"/>
-          <w:szCs w:val="18"/>
-          <w:rtl w:val="0"/>
-        </w:rPr>
-        <w:t xml:space="preserve"> es legítima, única y actual propietaria del vehículo identificado con los datos siguientes:</w:t>
+        <w:t xml:space="preserve"> en la calidad con que actúo, declaro que mi representada la entidad denominada CUBE INVESTMENTS, SOCIEDAD ANÓNIMA, es legítima</w:t>
+      </w:r>
+      <w:r>
+        <w:rPr>
+          <w:rFonts w:ascii="Arial" w:cs="Arial" w:eastAsia="Arial" w:hAnsi="Arial"/>
+          <w:b w:val="1"/>
+          <w:bCs w:val="1"/>
+          <w:sz w:val="18"/>
+          <w:szCs w:val="18"/>
+          <w:rtl w:val="0"/>
+        </w:rPr>
+        <w:t xml:space="preserve"/>
+      </w:r>
+      <w:r>
+        <w:rPr>
+          <w:rFonts w:ascii="Arial" w:cs="Arial" w:eastAsia="Arial" w:hAnsi="Arial"/>
+          <w:b w:val="1"/>
+          <w:bCs w:val="1"/>
+          <w:color w:val="000000"/>
+          <w:sz w:val="18"/>
+          <w:szCs w:val="18"/>
+          <w:rtl w:val="0"/>
+        </w:rPr>
+        <w:t xml:space="preserve"/>
+      </w:r>
+      <w:r>
+        <w:rPr>
+          <w:rFonts w:ascii="Arial" w:cs="Arial" w:eastAsia="Arial" w:hAnsi="Arial"/>
+          <w:color w:val="000000"/>
+          <w:sz w:val="18"/>
+          <w:szCs w:val="18"/>
+          <w:rtl w:val="0"/>
+        </w:rPr>
+        <w:t xml:space="preserve">, única y actual propietaria del vehículo identificado con los datos siguientes:</w:t>
       </w:r>
       <w:r>
         <w:rPr>

</xml_diff>